<commit_message>
docs: personalize PR1 report for Nikita Aliev with illustrations
</commit_message>
<xml_diff>
--- a/docs/report_pr1.docx
+++ b/docs/report_pr1.docx
@@ -4,166 +4,54 @@
   <w:body>
     <w:p>
       <w:pPr>
-        <w:pStyle w:val="Title"/>
+        <w:spacing w:before="1800"/>
+        <w:jc w:val="center"/>
       </w:pPr>
       <w:r>
-        <w:t>Отчёт по практической работе № 1</w:t>
-      </w:r>
-    </w:p>
-    <w:p>
-      <w:r>
-        <w:t>Дисциплина: [указать название дисциплины]</w:t>
-      </w:r>
-    </w:p>
-    <w:p>
-      <w:r>
-        <w:t>Тема работы: Основы Python. Настройка рабочего окружения. Начальная версия индивидуального проекта.</w:t>
-      </w:r>
-    </w:p>
-    <w:p>
-      <w:r>
-        <w:t>Группа: [указать группу]</w:t>
-      </w:r>
-    </w:p>
-    <w:p>
-      <w:r>
-        <w:t>ФИО студента: [указать ФИО]</w:t>
-      </w:r>
-    </w:p>
-    <w:p>
-      <w:r>
-        <w:t>Год выполнения: 2026</w:t>
+        <w:rPr>
+          <w:b/>
+          <w:sz w:val="28"/>
+        </w:rPr>
+        <w:t>«Технологии разработки приложения на базе фреймворков»</w:t>
       </w:r>
     </w:p>
     <w:p>
       <w:pPr>
-        <w:pStyle w:val="Heading1"/>
+        <w:spacing w:before="600"/>
+        <w:jc w:val="center"/>
       </w:pPr>
       <w:r>
-        <w:t>1. Цель работы</w:t>
-      </w:r>
-    </w:p>
-    <w:p>
-      <w:r>
-        <w:t>Закрепить простые типы данных, операции, преобразование типов, ветвления и импорт модулей Python; подготовить рабочее окружение и начальную версию индивидуального проекта с сохранением результата в Git.</w:t>
+        <w:rPr>
+          <w:b/>
+          <w:sz w:val="28"/>
+        </w:rPr>
+        <w:t>ПРАКТИЧЕСКАЯ РАБОТА № 1</w:t>
       </w:r>
     </w:p>
     <w:p>
       <w:pPr>
-        <w:pStyle w:val="Heading1"/>
+        <w:spacing w:before="600"/>
+        <w:jc w:val="center"/>
       </w:pPr>
       <w:r>
-        <w:t>2. Материалы Яндекс Практикума</w:t>
-      </w:r>
-    </w:p>
-    <w:tbl>
-      <w:tblPr>
-        <w:tblStyle w:val="TableGrid"/>
-        <w:tblW w:type="auto" w:w="0"/>
-        <w:tblLook w:firstColumn="1" w:firstRow="1" w:lastColumn="0" w:lastRow="0" w:noHBand="0" w:noVBand="1" w:val="04A0"/>
-      </w:tblPr>
-      <w:tblGrid>
-        <w:gridCol w:w="4819"/>
-        <w:gridCol w:w="4819"/>
-      </w:tblGrid>
-      <w:tr>
-        <w:tc>
-          <w:tcPr>
-            <w:tcW w:type="dxa" w:w="4819"/>
-          </w:tcPr>
-          <w:p>
-            <w:r>
-              <w:t>Раздел</w:t>
-            </w:r>
-          </w:p>
-        </w:tc>
-        <w:tc>
-          <w:tcPr>
-            <w:tcW w:type="dxa" w:w="4819"/>
-          </w:tcPr>
-          <w:p>
-            <w:r>
-              <w:t>Темы, предусмотренные ПР1</w:t>
-            </w:r>
-          </w:p>
-        </w:tc>
-      </w:tr>
-      <w:tr>
-        <w:tc>
-          <w:tcPr>
-            <w:tcW w:type="dxa" w:w="4819"/>
-          </w:tcPr>
-          <w:p>
-            <w:r>
-              <w:t>Основы Python</w:t>
-            </w:r>
-          </w:p>
-        </w:tc>
-        <w:tc>
-          <w:tcPr>
-            <w:tcW w:type="dxa" w:w="4819"/>
-          </w:tcPr>
-          <w:p>
-            <w:r>
-              <w:t>Погружение в Python; Простые типы данных; Ветвления; Импортируемые типы данных</w:t>
-            </w:r>
-          </w:p>
-        </w:tc>
-      </w:tr>
-      <w:tr>
-        <w:tc>
-          <w:tcPr>
-            <w:tcW w:type="dxa" w:w="4819"/>
-          </w:tcPr>
-          <w:p>
-            <w:r>
-              <w:t>Настройка рабочего окружения</w:t>
-            </w:r>
-          </w:p>
-        </w:tc>
-        <w:tc>
-          <w:tcPr>
-            <w:tcW w:type="dxa" w:w="4819"/>
-          </w:tcPr>
-          <w:p>
-            <w:r>
-              <w:t>Настройка рабочего окружения; Pytest; Система контроля и управления версиями; Требования к коду; Отладка программ</w:t>
-            </w:r>
-          </w:p>
-        </w:tc>
-      </w:tr>
-    </w:tbl>
-    <w:p>
-      <w:r>
-        <w:t>Статус прохождения перечисленных тем необходимо подтвердить в аккаунте Яндекс Практикума. Данные об их выполнении не предоставлены.</w:t>
+        <w:rPr>
+          <w:b/>
+          <w:sz w:val="28"/>
+        </w:rPr>
+        <w:t>ОСНОВЫ PYTHON: АКТУАЛИЗАЦИЯ ЗНАНИЙ И НАСТРОЙКА РАБОЧЕГО ОКРУЖЕНИЯ</w:t>
       </w:r>
     </w:p>
     <w:p>
       <w:pPr>
-        <w:pStyle w:val="Heading1"/>
+        <w:spacing w:before="600"/>
+        <w:jc w:val="center"/>
       </w:pPr>
       <w:r>
-        <w:t>3. Индивидуальный проект</w:t>
-      </w:r>
-    </w:p>
-    <w:p>
-      <w:r>
-        <w:t>Название: «Система управления консультациями». Предметная область: организация учебных консультаций студентов с преподавателями. Пользователи — студенты, преподаватели и учебный отдел. Основные сущности — пользователь, дисциплина, консультация и запись. Согласование темы с преподавателем требует отдельного подтверждения.</w:t>
-      </w:r>
-    </w:p>
-    <w:p>
-      <w:r>
-        <w:t>Репозиторий: https://github.com/NikiVence/consult_managing</w:t>
-      </w:r>
-    </w:p>
-    <w:p>
-      <w:r>
-        <w:t>На ПР1 реализована запись одного студента на учебную консультацию. Программа предлагает слот на завтра в 15:00, запрашивает имя и длительность от 15 до 90 минут. Функция get_booking_status() проверяет доступность, дату и длительность; calculate_end_time() рассчитывает время окончания; create_confirmation() формирует подтверждение. После успешной проверки слот становится занятым в пределах текущего запуска. Сохранение в базу данных планируется на следующих этапах.</w:t>
-      </w:r>
-    </w:p>
-    <w:p>
-      <w:r>
-        <w:t>Использованы строки, целые и вещественные числа, логический тип, деление, сравнения, преобразование int(), ветвления, логические операции, функции и импорт объектов datetime и timedelta. Например, ввод 45 преобразуется в число минут и в 0.75 часа. Коллекции, циклы и собственные классы в основном приложении не используются.</w:t>
+        <w:rPr>
+          <w:b/>
+          <w:sz w:val="28"/>
+        </w:rPr>
+        <w:t>ЭФБО-01-24. Алиев Никита. 2026 г.</w:t>
       </w:r>
     </w:p>
     <w:p>
@@ -176,22 +64,109 @@
         <w:pStyle w:val="Heading1"/>
       </w:pPr>
       <w:r>
-        <w:t>4. Результат работы</w:t>
+        <w:t>1. Материалы Яндекс Практикума</w:t>
       </w:r>
     </w:p>
     <w:p>
       <w:r>
-        <w:t>Подготовлено виртуальное окружение Python 3.12, настройки VS Code, .gitignore, README с описанием проекта и планом развития. Реализован законченный консольный сценарий. Добавлены pytest-проверки разрешённой записи, отказов, ввода и расчёта времени. Фактический результат выполнения команд сохранён в docs/verification.txt: 22 теста пройдены, проверка оформления Ruff завершена без ошибок.</w:t>
+        <w:t>Темы, предусмотренные практической работой:</w:t>
+      </w:r>
+    </w:p>
+    <w:p>
+      <w:r/>
+      <w:r>
+        <w:rPr>
+          <w:b/>
+        </w:rPr>
+        <w:t>Раздел 01. Основы Python:</w:t>
+      </w:r>
+      <w:r/>
+    </w:p>
+    <w:p>
+      <w:pPr>
+        <w:ind w:left="198" w:hanging="142"/>
+      </w:pPr>
+      <w:r>
+        <w:t>• Погружение в Python;</w:t>
+      </w:r>
+    </w:p>
+    <w:p>
+      <w:pPr>
+        <w:ind w:left="198" w:hanging="142"/>
+      </w:pPr>
+      <w:r>
+        <w:t>• Простые типы данных;</w:t>
+      </w:r>
+    </w:p>
+    <w:p>
+      <w:pPr>
+        <w:ind w:left="198" w:hanging="142"/>
+      </w:pPr>
+      <w:r>
+        <w:t>• Ветвления;</w:t>
+      </w:r>
+    </w:p>
+    <w:p>
+      <w:pPr>
+        <w:ind w:left="198" w:hanging="142"/>
+      </w:pPr>
+      <w:r>
+        <w:t>• Импортируемые типы данных.</w:t>
+      </w:r>
+    </w:p>
+    <w:p>
+      <w:r/>
+      <w:r>
+        <w:rPr>
+          <w:b/>
+        </w:rPr>
+        <w:t>Раздел 02. Настройка рабочего окружения:</w:t>
+      </w:r>
+      <w:r/>
+    </w:p>
+    <w:p>
+      <w:pPr>
+        <w:ind w:left="198" w:hanging="142"/>
+      </w:pPr>
+      <w:r>
+        <w:t>• Настройка рабочего окружения;</w:t>
+      </w:r>
+    </w:p>
+    <w:p>
+      <w:pPr>
+        <w:ind w:left="198" w:hanging="142"/>
+      </w:pPr>
+      <w:r>
+        <w:t>• Pytest;</w:t>
+      </w:r>
+    </w:p>
+    <w:p>
+      <w:pPr>
+        <w:ind w:left="198" w:hanging="142"/>
+      </w:pPr>
+      <w:r>
+        <w:t>• Система контроля и управления версиями;</w:t>
+      </w:r>
+    </w:p>
+    <w:p>
+      <w:pPr>
+        <w:ind w:left="198" w:hanging="142"/>
+      </w:pPr>
+      <w:r>
+        <w:t>• Требования к коду;</w:t>
+      </w:r>
+    </w:p>
+    <w:p>
+      <w:pPr>
+        <w:ind w:left="198" w:hanging="142"/>
+      </w:pPr>
+      <w:r>
+        <w:t>• Отладка программ.</w:t>
       </w:r>
     </w:p>
     <w:p>
       <w:r>
-        <w:t>Для упражнения по отладке в копии программы минуты намеренно заменены часами в timedelta. При начале 16.09.2026 15:00 и длительности 45 минут ошибочная версия получает 18.09.2026 12:00. Через отладчик pdb выполнены остановка, шаг и просмотр переменных. После исправления получено 16.09.2026 15:45. Протокол сохранён в docs/debugger_transcript.txt. Для обязательной демонстрации в IDE подготовлена конфигурация VS Code и инструкция docs/debugging.md; демонстрацию студент выполняет отдельно.</w:t>
-      </w:r>
-    </w:p>
-    <w:p>
-      <w:r>
-        <w:t>Начальное состояние и результат разработки сохраняются отдельными коммитами Git. Историю можно предъявить командой git log --oneline.</w:t>
+        <w:t>Прохождение тем подтверждается результатами в личном аккаунте Практикума.</w:t>
       </w:r>
     </w:p>
     <w:p>
@@ -199,17 +174,444 @@
         <w:pStyle w:val="Heading1"/>
       </w:pPr>
       <w:r>
-        <w:t>5. Вывод</w:t>
+        <w:t>2. Индивидуальный проект</w:t>
+      </w:r>
+    </w:p>
+    <w:p>
+      <w:r/>
+      <w:r>
+        <w:rPr>
+          <w:b/>
+        </w:rPr>
+        <w:t>Название проекта:</w:t>
+      </w:r>
+      <w:r>
+        <w:t xml:space="preserve"> «Система управления консультациями».</w:t>
+      </w:r>
+    </w:p>
+    <w:p>
+      <w:r/>
+      <w:r>
+        <w:rPr>
+          <w:b/>
+        </w:rPr>
+        <w:t>Предметная область:</w:t>
+      </w:r>
+      <w:r>
+        <w:t xml:space="preserve"> организация учебных консультаций — планирование встреч студентов с преподавателями, проверка доступности времени и запись на консультации. Основные сущности: пользователь, дисциплина, консультация и запись.</w:t>
+      </w:r>
+    </w:p>
+    <w:p>
+      <w:r/>
+      <w:r>
+        <w:rPr>
+          <w:b/>
+        </w:rPr>
+        <w:t>Реализованный на ПР1 функционал:</w:t>
+      </w:r>
+      <w:r/>
+    </w:p>
+    <w:p>
+      <w:pPr>
+        <w:ind w:left="198" w:hanging="142"/>
+      </w:pPr>
+      <w:r>
+        <w:t xml:space="preserve">• </w:t>
+      </w:r>
+      <w:r>
+        <w:t>get_booking_status()</w:t>
+      </w:r>
+      <w:r>
+        <w:t xml:space="preserve"> — проверка доступности слота, времени начала консультации и допустимой длительности от 15 до 90 минут;</w:t>
+      </w:r>
+    </w:p>
+    <w:p>
+      <w:pPr>
+        <w:ind w:left="198" w:hanging="142"/>
+      </w:pPr>
+      <w:r>
+        <w:t xml:space="preserve">• </w:t>
+      </w:r>
+      <w:r>
+        <w:t>calculate_end_time()</w:t>
+      </w:r>
+      <w:r>
+        <w:t xml:space="preserve"> — расчёт времени окончания консультации по времени начала и длительности;</w:t>
+      </w:r>
+    </w:p>
+    <w:p>
+      <w:pPr>
+        <w:ind w:left="198" w:hanging="142"/>
+      </w:pPr>
+      <w:r>
+        <w:t xml:space="preserve">• </w:t>
+      </w:r>
+      <w:r>
+        <w:t>create_confirmation()</w:t>
+      </w:r>
+      <w:r>
+        <w:t xml:space="preserve"> — формирование подтверждения записи с именами студента и преподавателя, темой и временем встречи;</w:t>
+      </w:r>
+    </w:p>
+    <w:p>
+      <w:pPr>
+        <w:ind w:left="198" w:hanging="142"/>
+      </w:pPr>
+      <w:r>
+        <w:t xml:space="preserve">• </w:t>
+      </w:r>
+      <w:r>
+        <w:t>main()</w:t>
+      </w:r>
+      <w:r>
+        <w:t xml:space="preserve"> — ввод имени студента и длительности, выполнение проверок, изменение доступности слота и вывод результата.</w:t>
       </w:r>
     </w:p>
     <w:p>
       <w:r>
-        <w:t>Подготовлена основа системы управления консультациями. На небольшом сценарии применены базовые конструкции Python, проверены правила записи и расчёт времени. Проект подходит для развития в Django-приложение с базой данных, ролями пользователей, REST API и контейнеризацией.</w:t>
+        <w:t>Программа предлагает консультацию на следующий день в 15:00. При вводе имени «Алиев Никита» и длительности 45 минут формируется подтверждение с окончанием в 15:45. Пустое имя и некорректная длительность приводят к отказу. Запись хранится в памяти до завершения программы.</w:t>
+      </w:r>
+    </w:p>
+    <w:p>
+      <w:r/>
+      <w:r>
+        <w:rPr>
+          <w:b/>
+        </w:rPr>
+        <w:t>Использованные конструкции Python:</w:t>
+      </w:r>
+      <w:r>
+        <w:t xml:space="preserve"> простые типы данных (</w:t>
+      </w:r>
+      <w:r>
+        <w:t>int</w:t>
+      </w:r>
+      <w:r>
+        <w:t xml:space="preserve">, </w:t>
+      </w:r>
+      <w:r>
+        <w:t>float</w:t>
+      </w:r>
+      <w:r>
+        <w:t xml:space="preserve">, </w:t>
+      </w:r>
+      <w:r>
+        <w:t>str</w:t>
+      </w:r>
+      <w:r>
+        <w:t xml:space="preserve">, </w:t>
+      </w:r>
+      <w:r>
+        <w:t>bool</w:t>
+      </w:r>
+      <w:r>
+        <w:t xml:space="preserve">), операции и преобразование типов, условные конструкции </w:t>
+      </w:r>
+      <w:r>
+        <w:t>if</w:t>
+      </w:r>
+      <w:r>
+        <w:t>–</w:t>
+      </w:r>
+      <w:r>
+        <w:t>elif</w:t>
+      </w:r>
+      <w:r>
+        <w:t xml:space="preserve">, логические операторы </w:t>
+      </w:r>
+      <w:r>
+        <w:t>or</w:t>
+      </w:r>
+      <w:r>
+        <w:t xml:space="preserve">, </w:t>
+      </w:r>
+      <w:r>
+        <w:t>not</w:t>
+      </w:r>
+      <w:r>
+        <w:t xml:space="preserve">, функции, импорт объектов </w:t>
+      </w:r>
+      <w:r>
+        <w:t>datetime</w:t>
+      </w:r>
+      <w:r>
+        <w:t xml:space="preserve"> и </w:t>
+      </w:r>
+      <w:r>
+        <w:t>timedelta</w:t>
+      </w:r>
+      <w:r>
+        <w:t>. Коллекции, циклы и собственные классы в основном приложении не используются.</w:t>
+      </w:r>
+    </w:p>
+    <w:p>
+      <w:r/>
+      <w:r>
+        <w:rPr>
+          <w:b/>
+        </w:rPr>
+        <w:t>Ссылка на Git-репозиторий:</w:t>
+      </w:r>
+      <w:r>
+        <w:t xml:space="preserve"> https://github.com/NikiVence/consult_managing</w:t>
+      </w:r>
+    </w:p>
+    <w:p>
+      <w:r>
+        <w:br w:type="page"/>
+      </w:r>
+    </w:p>
+    <w:p>
+      <w:pPr>
+        <w:pStyle w:val="Heading1"/>
+      </w:pPr>
+      <w:r>
+        <w:t>3. Результат работы</w:t>
+      </w:r>
+    </w:p>
+    <w:p>
+      <w:r>
+        <w:t>В результате выполнения ПР1:</w:t>
+      </w:r>
+    </w:p>
+    <w:p>
+      <w:pPr>
+        <w:ind w:left="198" w:hanging="142"/>
+      </w:pPr>
+      <w:r>
+        <w:t>• создано виртуальное окружение Python 3.12.5, подготовлены настройки VS Code;</w:t>
+      </w:r>
+    </w:p>
+    <w:p>
+      <w:pPr>
+        <w:ind w:left="198" w:hanging="142"/>
+      </w:pPr>
+      <w:r>
+        <w:t xml:space="preserve">• создан Git-репозиторий индивидуального проекта и добавлен </w:t>
+      </w:r>
+      <w:r>
+        <w:t>.gitignore</w:t>
+      </w:r>
+      <w:r>
+        <w:t>;</w:t>
+      </w:r>
+    </w:p>
+    <w:p>
+      <w:pPr>
+        <w:ind w:left="198" w:hanging="142"/>
+      </w:pPr>
+      <w:r>
+        <w:t xml:space="preserve">• подготовлен и заполнен </w:t>
+      </w:r>
+      <w:r>
+        <w:t>README.md</w:t>
+      </w:r>
+      <w:r>
+        <w:t>;</w:t>
+      </w:r>
+    </w:p>
+    <w:p>
+      <w:pPr>
+        <w:ind w:left="198" w:hanging="142"/>
+      </w:pPr>
+      <w:r>
+        <w:t>• реализован законченный сценарий с тремя функциями предметной области;</w:t>
+      </w:r>
+    </w:p>
+    <w:p>
+      <w:pPr>
+        <w:ind w:left="198" w:hanging="142"/>
+      </w:pPr>
+      <w:r>
+        <w:t>• пройдены 22 теста pytest; проверка оформления Ruff завершена без ошибок;</w:t>
+      </w:r>
+    </w:p>
+    <w:p>
+      <w:pPr>
+        <w:ind w:left="198" w:hanging="142"/>
+      </w:pPr>
+      <w:r>
+        <w:t xml:space="preserve">• выполнена отладка в </w:t>
+      </w:r>
+      <w:r>
+        <w:t>pdb</w:t>
+      </w:r>
+      <w:r>
+        <w:t>: установлена точка останова, выполнен шаг, просмотрены переменные, найдена и исправлена намеренно внесённая ошибка;</w:t>
+      </w:r>
+    </w:p>
+    <w:p>
+      <w:pPr>
+        <w:ind w:left="198" w:hanging="142"/>
+      </w:pPr>
+      <w:r>
+        <w:t>• результат сохранён в Git, проверена история и выполнена отправка на GitHub.</w:t>
+      </w:r>
+    </w:p>
+    <w:p>
+      <w:pPr>
+        <w:jc w:val="center"/>
+      </w:pPr>
+      <w:r>
+        <w:drawing>
+          <wp:inline xmlns:a="http://schemas.openxmlformats.org/drawingml/2006/main" xmlns:pic="http://schemas.openxmlformats.org/drawingml/2006/picture">
+            <wp:extent cx="4500000" cy="2618182"/>
+            <wp:docPr id="1" name="Picture 1"/>
+            <wp:cNvGraphicFramePr>
+              <a:graphicFrameLocks noChangeAspect="1"/>
+            </wp:cNvGraphicFramePr>
+            <a:graphic>
+              <a:graphicData uri="http://schemas.openxmlformats.org/drawingml/2006/picture">
+                <pic:pic>
+                  <pic:nvPicPr>
+                    <pic:cNvPr id="0" name="program_run.png"/>
+                    <pic:cNvPicPr/>
+                  </pic:nvPicPr>
+                  <pic:blipFill>
+                    <a:blip r:embed="rId9"/>
+                    <a:stretch>
+                      <a:fillRect/>
+                    </a:stretch>
+                  </pic:blipFill>
+                  <pic:spPr>
+                    <a:xfrm>
+                      <a:off x="0" y="0"/>
+                      <a:ext cx="4500000" cy="2618182"/>
+                    </a:xfrm>
+                    <a:prstGeom prst="rect"/>
+                  </pic:spPr>
+                </pic:pic>
+              </a:graphicData>
+            </a:graphic>
+          </wp:inline>
+        </w:drawing>
+      </w:r>
+    </w:p>
+    <w:p>
+      <w:pPr>
+        <w:jc w:val="center"/>
+      </w:pPr>
+      <w:r>
+        <w:rPr>
+          <w:i/>
+          <w:sz w:val="18"/>
+        </w:rPr>
+        <w:t>Рисунок 1 — Фактический вывод программы при записи Алиева Никиты на консультацию.</w:t>
+      </w:r>
+    </w:p>
+    <w:p>
+      <w:r>
+        <w:t xml:space="preserve">При отладке в копии функции </w:t>
+      </w:r>
+      <w:r>
+        <w:t>calculate_end_time()</w:t>
+      </w:r>
+      <w:r>
+        <w:t xml:space="preserve"> аргумент </w:t>
+      </w:r>
+      <w:r>
+        <w:t>minutes</w:t>
+      </w:r>
+      <w:r>
+        <w:t xml:space="preserve"> намеренно заменён на </w:t>
+      </w:r>
+      <w:r>
+        <w:t>hours</w:t>
+      </w:r>
+      <w:r>
+        <w:t>. Значение 45 стало интерпретироваться как число часов. После проверки переменных и исправления аргумента получено правильное время окончания — 15:45.</w:t>
+      </w:r>
+    </w:p>
+    <w:p>
+      <w:pPr>
+        <w:jc w:val="center"/>
+      </w:pPr>
+      <w:r>
+        <w:drawing>
+          <wp:inline xmlns:a="http://schemas.openxmlformats.org/drawingml/2006/main" xmlns:pic="http://schemas.openxmlformats.org/drawingml/2006/picture">
+            <wp:extent cx="4500000" cy="1505455"/>
+            <wp:docPr id="2" name="Picture 2"/>
+            <wp:cNvGraphicFramePr>
+              <a:graphicFrameLocks noChangeAspect="1"/>
+            </wp:cNvGraphicFramePr>
+            <a:graphic>
+              <a:graphicData uri="http://schemas.openxmlformats.org/drawingml/2006/picture">
+                <pic:pic>
+                  <pic:nvPicPr>
+                    <pic:cNvPr id="0" name="debugging.png"/>
+                    <pic:cNvPicPr/>
+                  </pic:nvPicPr>
+                  <pic:blipFill>
+                    <a:blip r:embed="rId10"/>
+                    <a:stretch>
+                      <a:fillRect/>
+                    </a:stretch>
+                  </pic:blipFill>
+                  <pic:spPr>
+                    <a:xfrm>
+                      <a:off x="0" y="0"/>
+                      <a:ext cx="4500000" cy="1505455"/>
+                    </a:xfrm>
+                    <a:prstGeom prst="rect"/>
+                  </pic:spPr>
+                </pic:pic>
+              </a:graphicData>
+            </a:graphic>
+          </wp:inline>
+        </w:drawing>
+      </w:r>
+    </w:p>
+    <w:p>
+      <w:pPr>
+        <w:jc w:val="center"/>
+      </w:pPr>
+      <w:r>
+        <w:rPr>
+          <w:i/>
+          <w:sz w:val="18"/>
+        </w:rPr>
+        <w:t>Рисунок 2 — Фрагменты фактического протокола pdb до и после исправления ошибки.</w:t>
+      </w:r>
+    </w:p>
+    <w:p>
+      <w:r>
+        <w:t xml:space="preserve">Иллюстрации оформлены из текстового вывода запусков; исходные данные сохранены в </w:t>
+      </w:r>
+      <w:r>
+        <w:t>docs/report_run.txt</w:t>
+      </w:r>
+      <w:r>
+        <w:t xml:space="preserve"> и </w:t>
+      </w:r>
+      <w:r>
+        <w:t>docs/debugger_transcript.txt</w:t>
+      </w:r>
+      <w:r>
+        <w:t xml:space="preserve">. Для демонстрации отладки в IDE подготовлены конфигурация VS Code и инструкция </w:t>
+      </w:r>
+      <w:r>
+        <w:t>docs/debugging.md</w:t>
+      </w:r>
+      <w:r>
+        <w:t>.</w:t>
+      </w:r>
+    </w:p>
+    <w:p>
+      <w:pPr>
+        <w:pStyle w:val="Heading1"/>
+      </w:pPr>
+      <w:r>
+        <w:t>4. Вывод</w:t>
+      </w:r>
+    </w:p>
+    <w:p>
+      <w:r>
+        <w:t>В ходе практической работы применены базовые конструкции Python, подготовлено рабочее окружение и создана стартовая версия индивидуального проекта «Система управления консультациями». Реализованы проверка возможности записи, расчёт окончания и подтверждение консультации. Подготовлена основа для дальнейшей разработки веб-приложения на Django с базой данных, пользователями и REST API.</w:t>
       </w:r>
     </w:p>
     <w:sectPr>
       <w:pgSz w:w="11906" w:h="16838"/>
-      <w:pgMar w:top="1020" w:right="1020" w:bottom="1020" w:left="1247" w:header="720" w:footer="720" w:gutter="0"/>
+      <w:pgMar w:top="850" w:right="850" w:bottom="850" w:left="1134" w:header="720" w:footer="720" w:gutter="0"/>
       <w:cols w:space="720"/>
       <w:docGrid w:linePitch="360"/>
     </w:sectPr>
@@ -581,7 +983,7 @@
     <w:qFormat/>
     <w:rsid w:val="00FC693F"/>
     <w:pPr>
-      <w:spacing w:after="100" w:line="252" w:lineRule="auto"/>
+      <w:spacing w:after="40" w:line="240" w:lineRule="auto"/>
     </w:pPr>
     <w:rPr>
       <w:rFonts w:ascii="Times New Roman" w:hAnsi="Times New Roman"/>
@@ -643,14 +1045,14 @@
     <w:pPr>
       <w:keepNext/>
       <w:keepLines/>
-      <w:spacing w:before="480" w:after="0"/>
+      <w:spacing w:before="160" w:after="100"/>
       <w:outlineLvl w:val="0"/>
     </w:pPr>
     <w:rPr>
       <w:rFonts w:asciiTheme="majorHAnsi" w:eastAsiaTheme="majorEastAsia" w:hAnsiTheme="majorHAnsi" w:cstheme="majorBidi" w:ascii="Times New Roman" w:hAnsi="Times New Roman"/>
       <w:b/>
       <w:bCs/>
-      <w:color w:val="365F91" w:themeColor="accent1" w:themeShade="BF"/>
+      <w:color w:val="000000"/>
       <w:sz w:val="24"/>
       <w:szCs w:val="28"/>
     </w:rPr>
@@ -667,14 +1069,14 @@
     <w:pPr>
       <w:keepNext/>
       <w:keepLines/>
-      <w:spacing w:before="200" w:after="0"/>
+      <w:spacing w:before="160" w:after="100"/>
       <w:outlineLvl w:val="1"/>
     </w:pPr>
     <w:rPr>
       <w:rFonts w:asciiTheme="majorHAnsi" w:eastAsiaTheme="majorEastAsia" w:hAnsiTheme="majorHAnsi" w:cstheme="majorBidi" w:ascii="Times New Roman" w:hAnsi="Times New Roman"/>
       <w:b/>
       <w:bCs/>
-      <w:color w:val="4F81BD" w:themeColor="accent1"/>
+      <w:color w:val="000000"/>
       <w:sz w:val="24"/>
       <w:szCs w:val="26"/>
     </w:rPr>
@@ -936,11 +1338,11 @@
       <w:contextualSpacing/>
     </w:pPr>
     <w:rPr>
-      <w:rFonts w:asciiTheme="majorHAnsi" w:eastAsiaTheme="majorEastAsia" w:hAnsiTheme="majorHAnsi" w:cstheme="majorBidi" w:ascii="Times New Roman" w:hAnsi="Times New Roman"/>
+      <w:rFonts w:asciiTheme="majorHAnsi" w:eastAsiaTheme="majorEastAsia" w:hAnsiTheme="majorHAnsi" w:cstheme="majorBidi"/>
       <w:color w:val="17365D" w:themeColor="text2" w:themeShade="BF"/>
       <w:spacing w:val="5"/>
       <w:kern w:val="28"/>
-      <w:sz w:val="28"/>
+      <w:sz w:val="52"/>
       <w:szCs w:val="52"/>
     </w:rPr>
   </w:style>

</xml_diff>